<commit_message>
Update guide with serial number modes and 8-SN examples
- New section: Serial Number Modes (3 modes with examples)
  Mode 1: Different SNs per half (pairs consecutive, odd = blank bottom)
  Mode 2: Same SN both halves (1 page per SN)
  Mode 3: Same SN + multiple copies (2+ pages per SN)
- 8-serial-number examples showing exact page output for each mode
- Quick reference table mapping mode to Per Page / Copies settings
- Added {WELLHEAD_QTY} placeholder documentation
- Updated provided templates table with SN mode and config settings
- New troubleshooting entry for double-sticker issues

Co-Authored-By: Claude Opus 4.6 <noreply@anthropic.com>
</commit_message>
<xml_diff>
--- a/helpful documents/Template_Library_Samples/Shipping_Template_Library_Guide.docx
+++ b/helpful documents/Template_Library_Samples/Shipping_Template_Library_Guide.docx
@@ -182,7 +182,7 @@
               <w:rPr>
                 <w:sz w:val="18"/>
               </w:rPr>
-              <w:t>Second serial number (2-up layouts only)</w:t>
+              <w:t>Second serial number (2-up different SN mode)</w:t>
             </w:r>
           </w:p>
         </w:tc>
@@ -405,6 +405,47 @@
           </w:p>
         </w:tc>
       </w:tr>
+      <w:tr>
+        <w:tc>
+          <w:tcPr>
+            <w:tcW w:type="dxa" w:w="2880"/>
+          </w:tcPr>
+          <w:p>
+            <w:r>
+              <w:rPr>
+                <w:sz w:val="18"/>
+              </w:rPr>
+              <w:t>{WELLHEAD_QTY}</w:t>
+            </w:r>
+          </w:p>
+        </w:tc>
+        <w:tc>
+          <w:tcPr>
+            <w:tcW w:type="dxa" w:w="2880"/>
+          </w:tcPr>
+          <w:p>
+            <w:r>
+              <w:rPr>
+                <w:sz w:val="18"/>
+              </w:rPr>
+              <w:t>Wellhead quantity from the generation form</w:t>
+            </w:r>
+          </w:p>
+        </w:tc>
+        <w:tc>
+          <w:tcPr>
+            <w:tcW w:type="dxa" w:w="2880"/>
+          </w:tcPr>
+          <w:p>
+            <w:r>
+              <w:rPr>
+                <w:sz w:val="18"/>
+              </w:rPr>
+              <w:t>2</w:t>
+            </w:r>
+          </w:p>
+        </w:tc>
+      </w:tr>
     </w:tbl>
     <w:p/>
     <w:p>
@@ -432,7 +473,7 @@
     </w:p>
     <w:p>
       <w:r>
-        <w:t>All templates MUST use a table-based layout to guarantee everything prints on a single page. This is critical for half-sheet label stock (8.5" x 5.5" per label, 2 per page).</w:t>
+        <w:t>All templates use a table-based layout to guarantee everything prints on a single page. Every template is formatted for half-sheet label stock (8.5" x 5.5" per label, 2 labels per page).</w:t>
       </w:r>
     </w:p>
     <w:p>
@@ -462,7 +503,7 @@
         <w:rPr>
           <w:sz w:val="20"/>
         </w:rPr>
-        <w:t>For 2-up (half sheet) stickers: 2 rows, each set to exactly 5.15" height.</w:t>
+        <w:t>Always 2 rows, each set to exactly 5.15" height.</w:t>
       </w:r>
     </w:p>
     <w:p>
@@ -473,18 +514,7 @@
         <w:rPr>
           <w:sz w:val="20"/>
         </w:rPr>
-        <w:t>For single full-page stickers: 1 row set to 10.3" height.</w:t>
-      </w:r>
-    </w:p>
-    <w:p>
-      <w:pPr>
-        <w:pStyle w:val="ListBullet"/>
-      </w:pPr>
-      <w:r>
-        <w:rPr>
-          <w:sz w:val="20"/>
-        </w:rPr>
-        <w:t>Row heights are set to "Exact" — content is physically locked within each row.</w:t>
+        <w:t>Row heights are set to "Exact" — content is physically locked within each row and cannot overflow to page 2.</w:t>
       </w:r>
     </w:p>
     <w:p>
@@ -506,7 +536,7 @@
         <w:rPr>
           <w:sz w:val="20"/>
         </w:rPr>
-        <w:t>Even if text wraps to multiple lines, it cannot push to page 2.</w:t>
+        <w:t>Even if text wraps to multiple lines, it stays within its half of the page.</w:t>
       </w:r>
     </w:p>
     <w:p>
@@ -625,7 +655,7 @@
                 <w:b/>
                 <w:sz w:val="20"/>
               </w:rPr>
-              <w:t>Row Height (2-up)</w:t>
+              <w:t>Row Height</w:t>
             </w:r>
           </w:p>
         </w:tc>
@@ -638,7 +668,121 @@
               <w:rPr>
                 <w:sz w:val="20"/>
               </w:rPr>
-              <w:t>5.15" each (exact)</w:t>
+              <w:t>5.15" each (exact) — always 2 rows</w:t>
+            </w:r>
+          </w:p>
+        </w:tc>
+      </w:tr>
+    </w:tbl>
+    <w:p>
+      <w:pPr>
+        <w:pStyle w:val="Heading1"/>
+      </w:pPr>
+      <w:r>
+        <w:t>Serial Number Modes: How Stickers Use Serial Numbers</w:t>
+      </w:r>
+    </w:p>
+    <w:p>
+      <w:r>
+        <w:t>There are three different ways a half-sheet template can handle serial numbers. The mode is determined by how the template is built (which placeholders it uses) and the kit config rule settings (per_page and copies_per_sn).</w:t>
+      </w:r>
+    </w:p>
+    <w:p>
+      <w:pPr>
+        <w:pStyle w:val="Heading2"/>
+      </w:pPr>
+      <w:r>
+        <w:t>Mode 1: Two Different Serial Numbers Per Page</w:t>
+      </w:r>
+    </w:p>
+    <w:p>
+      <w:r>
+        <w:rPr>
+          <w:b/>
+        </w:rPr>
+        <w:t xml:space="preserve">Template: </w:t>
+      </w:r>
+      <w:r>
+        <w:t>Top half uses {SERIAL_NUMBER}, bottom half uses {SERIAL_NUMBER_2}</w:t>
+      </w:r>
+    </w:p>
+    <w:p>
+      <w:r>
+        <w:rPr>
+          <w:b/>
+        </w:rPr>
+        <w:t xml:space="preserve">Kit Config: </w:t>
+      </w:r>
+      <w:r>
+        <w:t>Per Page = 2 (Half Page), Copies Per SN = 1</w:t>
+      </w:r>
+    </w:p>
+    <w:p>
+      <w:r>
+        <w:t>The system pairs consecutive serial numbers on each page. If there is an odd number of serial numbers, the last page will have the bottom sticker blank.</w:t>
+      </w:r>
+    </w:p>
+    <w:p/>
+    <w:p>
+      <w:r>
+        <w:rPr>
+          <w:b/>
+          <w:sz w:val="20"/>
+        </w:rPr>
+        <w:t>Example with 8 serial numbers (6001–6008):</w:t>
+      </w:r>
+    </w:p>
+    <w:tbl>
+      <w:tblPr>
+        <w:tblStyle w:val="TableGrid"/>
+        <w:tblW w:type="auto" w:w="0"/>
+        <w:tblLook w:firstColumn="1" w:firstRow="1" w:lastColumn="0" w:lastRow="0" w:noHBand="0" w:noVBand="1" w:val="04A0"/>
+      </w:tblPr>
+      <w:tblGrid>
+        <w:gridCol w:w="2880"/>
+        <w:gridCol w:w="2880"/>
+        <w:gridCol w:w="2880"/>
+      </w:tblGrid>
+      <w:tr>
+        <w:tc>
+          <w:tcPr>
+            <w:tcW w:type="dxa" w:w="2880"/>
+          </w:tcPr>
+          <w:p>
+            <w:r>
+              <w:rPr>
+                <w:b/>
+                <w:sz w:val="18"/>
+              </w:rPr>
+              <w:t>Page</w:t>
+            </w:r>
+          </w:p>
+        </w:tc>
+        <w:tc>
+          <w:tcPr>
+            <w:tcW w:type="dxa" w:w="2880"/>
+          </w:tcPr>
+          <w:p>
+            <w:r>
+              <w:rPr>
+                <w:b/>
+                <w:sz w:val="18"/>
+              </w:rPr>
+              <w:t>Top Sticker</w:t>
+            </w:r>
+          </w:p>
+        </w:tc>
+        <w:tc>
+          <w:tcPr>
+            <w:tcW w:type="dxa" w:w="2880"/>
+          </w:tcPr>
+          <w:p>
+            <w:r>
+              <w:rPr>
+                <w:b/>
+                <w:sz w:val="18"/>
+              </w:rPr>
+              <w:t>Bottom Sticker</w:t>
             </w:r>
           </w:p>
         </w:tc>
@@ -646,28 +790,1297 @@
       <w:tr>
         <w:tc>
           <w:tcPr>
-            <w:tcW w:type="dxa" w:w="4320"/>
+            <w:tcW w:type="dxa" w:w="2880"/>
+          </w:tcPr>
+          <w:p>
+            <w:r>
+              <w:rPr>
+                <w:sz w:val="18"/>
+              </w:rPr>
+              <w:t>Page 1</w:t>
+            </w:r>
+          </w:p>
+        </w:tc>
+        <w:tc>
+          <w:tcPr>
+            <w:tcW w:type="dxa" w:w="2880"/>
+          </w:tcPr>
+          <w:p>
+            <w:r>
+              <w:rPr>
+                <w:sz w:val="18"/>
+              </w:rPr>
+              <w:t>SN 6001</w:t>
+            </w:r>
+          </w:p>
+        </w:tc>
+        <w:tc>
+          <w:tcPr>
+            <w:tcW w:type="dxa" w:w="2880"/>
+          </w:tcPr>
+          <w:p>
+            <w:r>
+              <w:rPr>
+                <w:sz w:val="18"/>
+              </w:rPr>
+              <w:t>SN 6002</w:t>
+            </w:r>
+          </w:p>
+        </w:tc>
+      </w:tr>
+      <w:tr>
+        <w:tc>
+          <w:tcPr>
+            <w:tcW w:type="dxa" w:w="2880"/>
+          </w:tcPr>
+          <w:p>
+            <w:r>
+              <w:rPr>
+                <w:sz w:val="18"/>
+              </w:rPr>
+              <w:t>Page 2</w:t>
+            </w:r>
+          </w:p>
+        </w:tc>
+        <w:tc>
+          <w:tcPr>
+            <w:tcW w:type="dxa" w:w="2880"/>
+          </w:tcPr>
+          <w:p>
+            <w:r>
+              <w:rPr>
+                <w:sz w:val="18"/>
+              </w:rPr>
+              <w:t>SN 6003</w:t>
+            </w:r>
+          </w:p>
+        </w:tc>
+        <w:tc>
+          <w:tcPr>
+            <w:tcW w:type="dxa" w:w="2880"/>
+          </w:tcPr>
+          <w:p>
+            <w:r>
+              <w:rPr>
+                <w:sz w:val="18"/>
+              </w:rPr>
+              <w:t>SN 6004</w:t>
+            </w:r>
+          </w:p>
+        </w:tc>
+      </w:tr>
+      <w:tr>
+        <w:tc>
+          <w:tcPr>
+            <w:tcW w:type="dxa" w:w="2880"/>
+          </w:tcPr>
+          <w:p>
+            <w:r>
+              <w:rPr>
+                <w:sz w:val="18"/>
+              </w:rPr>
+              <w:t>Page 3</w:t>
+            </w:r>
+          </w:p>
+        </w:tc>
+        <w:tc>
+          <w:tcPr>
+            <w:tcW w:type="dxa" w:w="2880"/>
+          </w:tcPr>
+          <w:p>
+            <w:r>
+              <w:rPr>
+                <w:sz w:val="18"/>
+              </w:rPr>
+              <w:t>SN 6005</w:t>
+            </w:r>
+          </w:p>
+        </w:tc>
+        <w:tc>
+          <w:tcPr>
+            <w:tcW w:type="dxa" w:w="2880"/>
+          </w:tcPr>
+          <w:p>
+            <w:r>
+              <w:rPr>
+                <w:sz w:val="18"/>
+              </w:rPr>
+              <w:t>SN 6006</w:t>
+            </w:r>
+          </w:p>
+        </w:tc>
+      </w:tr>
+      <w:tr>
+        <w:tc>
+          <w:tcPr>
+            <w:tcW w:type="dxa" w:w="2880"/>
+          </w:tcPr>
+          <w:p>
+            <w:r>
+              <w:rPr>
+                <w:sz w:val="18"/>
+              </w:rPr>
+              <w:t>Page 4</w:t>
+            </w:r>
+          </w:p>
+        </w:tc>
+        <w:tc>
+          <w:tcPr>
+            <w:tcW w:type="dxa" w:w="2880"/>
+          </w:tcPr>
+          <w:p>
+            <w:r>
+              <w:rPr>
+                <w:sz w:val="18"/>
+              </w:rPr>
+              <w:t>SN 6007</w:t>
+            </w:r>
+          </w:p>
+        </w:tc>
+        <w:tc>
+          <w:tcPr>
+            <w:tcW w:type="dxa" w:w="2880"/>
+          </w:tcPr>
+          <w:p>
+            <w:r>
+              <w:rPr>
+                <w:sz w:val="18"/>
+              </w:rPr>
+              <w:t>SN 6008</w:t>
+            </w:r>
+          </w:p>
+        </w:tc>
+      </w:tr>
+    </w:tbl>
+    <w:p>
+      <w:r>
+        <w:rPr>
+          <w:b/>
+          <w:sz w:val="20"/>
+        </w:rPr>
+        <w:t>Result: 4 pages, 8 stickers. No wasted paper.</w:t>
+      </w:r>
+    </w:p>
+    <w:p/>
+    <w:p>
+      <w:r>
+        <w:rPr>
+          <w:b/>
+          <w:sz w:val="20"/>
+        </w:rPr>
+        <w:t>Example with 5 serial numbers (odd count):</w:t>
+      </w:r>
+    </w:p>
+    <w:tbl>
+      <w:tblPr>
+        <w:tblStyle w:val="TableGrid"/>
+        <w:tblW w:type="auto" w:w="0"/>
+        <w:tblLook w:firstColumn="1" w:firstRow="1" w:lastColumn="0" w:lastRow="0" w:noHBand="0" w:noVBand="1" w:val="04A0"/>
+      </w:tblPr>
+      <w:tblGrid>
+        <w:gridCol w:w="2880"/>
+        <w:gridCol w:w="2880"/>
+        <w:gridCol w:w="2880"/>
+      </w:tblGrid>
+      <w:tr>
+        <w:tc>
+          <w:tcPr>
+            <w:tcW w:type="dxa" w:w="2880"/>
           </w:tcPr>
           <w:p>
             <w:r>
               <w:rPr>
                 <w:b/>
-                <w:sz w:val="20"/>
+                <w:sz w:val="18"/>
               </w:rPr>
-              <w:t>Row Height (full page)</w:t>
+              <w:t>Page</w:t>
             </w:r>
           </w:p>
         </w:tc>
         <w:tc>
           <w:tcPr>
-            <w:tcW w:type="dxa" w:w="4320"/>
+            <w:tcW w:type="dxa" w:w="2880"/>
           </w:tcPr>
           <w:p>
             <w:r>
               <w:rPr>
-                <w:sz w:val="20"/>
+                <w:b/>
+                <w:sz w:val="18"/>
               </w:rPr>
-              <w:t>10.3" (exact)</w:t>
+              <w:t>Top Sticker</w:t>
+            </w:r>
+          </w:p>
+        </w:tc>
+        <w:tc>
+          <w:tcPr>
+            <w:tcW w:type="dxa" w:w="2880"/>
+          </w:tcPr>
+          <w:p>
+            <w:r>
+              <w:rPr>
+                <w:b/>
+                <w:sz w:val="18"/>
+              </w:rPr>
+              <w:t>Bottom Sticker</w:t>
+            </w:r>
+          </w:p>
+        </w:tc>
+      </w:tr>
+      <w:tr>
+        <w:tc>
+          <w:tcPr>
+            <w:tcW w:type="dxa" w:w="2880"/>
+          </w:tcPr>
+          <w:p>
+            <w:r>
+              <w:rPr>
+                <w:sz w:val="18"/>
+              </w:rPr>
+              <w:t>Page 1</w:t>
+            </w:r>
+          </w:p>
+        </w:tc>
+        <w:tc>
+          <w:tcPr>
+            <w:tcW w:type="dxa" w:w="2880"/>
+          </w:tcPr>
+          <w:p>
+            <w:r>
+              <w:rPr>
+                <w:sz w:val="18"/>
+              </w:rPr>
+              <w:t>SN 6001</w:t>
+            </w:r>
+          </w:p>
+        </w:tc>
+        <w:tc>
+          <w:tcPr>
+            <w:tcW w:type="dxa" w:w="2880"/>
+          </w:tcPr>
+          <w:p>
+            <w:r>
+              <w:rPr>
+                <w:sz w:val="18"/>
+              </w:rPr>
+              <w:t>SN 6002</w:t>
+            </w:r>
+          </w:p>
+        </w:tc>
+      </w:tr>
+      <w:tr>
+        <w:tc>
+          <w:tcPr>
+            <w:tcW w:type="dxa" w:w="2880"/>
+          </w:tcPr>
+          <w:p>
+            <w:r>
+              <w:rPr>
+                <w:sz w:val="18"/>
+              </w:rPr>
+              <w:t>Page 2</w:t>
+            </w:r>
+          </w:p>
+        </w:tc>
+        <w:tc>
+          <w:tcPr>
+            <w:tcW w:type="dxa" w:w="2880"/>
+          </w:tcPr>
+          <w:p>
+            <w:r>
+              <w:rPr>
+                <w:sz w:val="18"/>
+              </w:rPr>
+              <w:t>SN 6003</w:t>
+            </w:r>
+          </w:p>
+        </w:tc>
+        <w:tc>
+          <w:tcPr>
+            <w:tcW w:type="dxa" w:w="2880"/>
+          </w:tcPr>
+          <w:p>
+            <w:r>
+              <w:rPr>
+                <w:sz w:val="18"/>
+              </w:rPr>
+              <w:t>SN 6004</w:t>
+            </w:r>
+          </w:p>
+        </w:tc>
+      </w:tr>
+      <w:tr>
+        <w:tc>
+          <w:tcPr>
+            <w:tcW w:type="dxa" w:w="2880"/>
+          </w:tcPr>
+          <w:p>
+            <w:r>
+              <w:rPr>
+                <w:sz w:val="18"/>
+              </w:rPr>
+              <w:t>Page 3</w:t>
+            </w:r>
+          </w:p>
+        </w:tc>
+        <w:tc>
+          <w:tcPr>
+            <w:tcW w:type="dxa" w:w="2880"/>
+          </w:tcPr>
+          <w:p>
+            <w:r>
+              <w:rPr>
+                <w:sz w:val="18"/>
+              </w:rPr>
+              <w:t>SN 6005</w:t>
+            </w:r>
+          </w:p>
+        </w:tc>
+        <w:tc>
+          <w:tcPr>
+            <w:tcW w:type="dxa" w:w="2880"/>
+          </w:tcPr>
+          <w:p>
+            <w:r>
+              <w:rPr>
+                <w:sz w:val="18"/>
+              </w:rPr>
+              <w:t>(blank — reuse label later)</w:t>
+            </w:r>
+          </w:p>
+        </w:tc>
+      </w:tr>
+    </w:tbl>
+    <w:p>
+      <w:r>
+        <w:rPr>
+          <w:b/>
+          <w:sz w:val="20"/>
+        </w:rPr>
+        <w:t>Result: 3 pages, 5 stickers. Bottom of last page stays blank for reuse.</w:t>
+      </w:r>
+    </w:p>
+    <w:p>
+      <w:r>
+        <w:rPr>
+          <w:b/>
+          <w:sz w:val="20"/>
+        </w:rPr>
+        <w:t xml:space="preserve">Use this for: </w:t>
+      </w:r>
+      <w:r>
+        <w:rPr>
+          <w:sz w:val="20"/>
+        </w:rPr>
+        <w:t>Sticker on box #1 stateline (each RIO panel needs 1 sticker, pairs consecutive SNs to minimize paper).</w:t>
+      </w:r>
+    </w:p>
+    <w:p>
+      <w:pPr>
+        <w:pStyle w:val="Heading2"/>
+      </w:pPr>
+      <w:r>
+        <w:t>Mode 2: Same Serial Number on Both Halves (1 Copy)</w:t>
+      </w:r>
+    </w:p>
+    <w:p>
+      <w:r>
+        <w:rPr>
+          <w:b/>
+        </w:rPr>
+        <w:t xml:space="preserve">Template: </w:t>
+      </w:r>
+      <w:r>
+        <w:t>Both top and bottom halves use {SERIAL_NUMBER} (no {SERIAL_NUMBER_2})</w:t>
+      </w:r>
+    </w:p>
+    <w:p>
+      <w:r>
+        <w:rPr>
+          <w:b/>
+        </w:rPr>
+        <w:t xml:space="preserve">Kit Config: </w:t>
+      </w:r>
+      <w:r>
+        <w:t>Per Page = 1 (Full Page), Copies Per SN = 1</w:t>
+      </w:r>
+    </w:p>
+    <w:p>
+      <w:r>
+        <w:t>Each serial number gets its own page. Both halves of the page show the same serial number. This is used when the top and bottom stickers have different content but belong to the same unit.</w:t>
+      </w:r>
+    </w:p>
+    <w:p/>
+    <w:p>
+      <w:r>
+        <w:rPr>
+          <w:b/>
+          <w:sz w:val="20"/>
+        </w:rPr>
+        <w:t>Example with 8 serial numbers (6001–6008):</w:t>
+      </w:r>
+    </w:p>
+    <w:tbl>
+      <w:tblPr>
+        <w:tblStyle w:val="TableGrid"/>
+        <w:tblW w:type="auto" w:w="0"/>
+        <w:tblLook w:firstColumn="1" w:firstRow="1" w:lastColumn="0" w:lastRow="0" w:noHBand="0" w:noVBand="1" w:val="04A0"/>
+      </w:tblPr>
+      <w:tblGrid>
+        <w:gridCol w:w="2880"/>
+        <w:gridCol w:w="2880"/>
+        <w:gridCol w:w="2880"/>
+      </w:tblGrid>
+      <w:tr>
+        <w:tc>
+          <w:tcPr>
+            <w:tcW w:type="dxa" w:w="2880"/>
+          </w:tcPr>
+          <w:p>
+            <w:r>
+              <w:rPr>
+                <w:b/>
+                <w:sz w:val="18"/>
+              </w:rPr>
+              <w:t>Page</w:t>
+            </w:r>
+          </w:p>
+        </w:tc>
+        <w:tc>
+          <w:tcPr>
+            <w:tcW w:type="dxa" w:w="2880"/>
+          </w:tcPr>
+          <w:p>
+            <w:r>
+              <w:rPr>
+                <w:b/>
+                <w:sz w:val="18"/>
+              </w:rPr>
+              <w:t>Top Sticker</w:t>
+            </w:r>
+          </w:p>
+        </w:tc>
+        <w:tc>
+          <w:tcPr>
+            <w:tcW w:type="dxa" w:w="2880"/>
+          </w:tcPr>
+          <w:p>
+            <w:r>
+              <w:rPr>
+                <w:b/>
+                <w:sz w:val="18"/>
+              </w:rPr>
+              <w:t>Bottom Sticker</w:t>
+            </w:r>
+          </w:p>
+        </w:tc>
+      </w:tr>
+      <w:tr>
+        <w:tc>
+          <w:tcPr>
+            <w:tcW w:type="dxa" w:w="2880"/>
+          </w:tcPr>
+          <w:p>
+            <w:r>
+              <w:rPr>
+                <w:sz w:val="18"/>
+              </w:rPr>
+              <w:t>Page 1</w:t>
+            </w:r>
+          </w:p>
+        </w:tc>
+        <w:tc>
+          <w:tcPr>
+            <w:tcW w:type="dxa" w:w="2880"/>
+          </w:tcPr>
+          <w:p>
+            <w:r>
+              <w:rPr>
+                <w:sz w:val="18"/>
+              </w:rPr>
+              <w:t>Box #1 (SN 6001)</w:t>
+            </w:r>
+          </w:p>
+        </w:tc>
+        <w:tc>
+          <w:tcPr>
+            <w:tcW w:type="dxa" w:w="2880"/>
+          </w:tcPr>
+          <w:p>
+            <w:r>
+              <w:rPr>
+                <w:sz w:val="18"/>
+              </w:rPr>
+              <w:t>Box #2 (SN 6001)</w:t>
+            </w:r>
+          </w:p>
+        </w:tc>
+      </w:tr>
+      <w:tr>
+        <w:tc>
+          <w:tcPr>
+            <w:tcW w:type="dxa" w:w="2880"/>
+          </w:tcPr>
+          <w:p>
+            <w:r>
+              <w:rPr>
+                <w:sz w:val="18"/>
+              </w:rPr>
+              <w:t>Page 2</w:t>
+            </w:r>
+          </w:p>
+        </w:tc>
+        <w:tc>
+          <w:tcPr>
+            <w:tcW w:type="dxa" w:w="2880"/>
+          </w:tcPr>
+          <w:p>
+            <w:r>
+              <w:rPr>
+                <w:sz w:val="18"/>
+              </w:rPr>
+              <w:t>Box #1 (SN 6002)</w:t>
+            </w:r>
+          </w:p>
+        </w:tc>
+        <w:tc>
+          <w:tcPr>
+            <w:tcW w:type="dxa" w:w="2880"/>
+          </w:tcPr>
+          <w:p>
+            <w:r>
+              <w:rPr>
+                <w:sz w:val="18"/>
+              </w:rPr>
+              <w:t>Box #2 (SN 6002)</w:t>
+            </w:r>
+          </w:p>
+        </w:tc>
+      </w:tr>
+      <w:tr>
+        <w:tc>
+          <w:tcPr>
+            <w:tcW w:type="dxa" w:w="2880"/>
+          </w:tcPr>
+          <w:p>
+            <w:r>
+              <w:rPr>
+                <w:sz w:val="18"/>
+              </w:rPr>
+              <w:t>...</w:t>
+            </w:r>
+          </w:p>
+        </w:tc>
+        <w:tc>
+          <w:tcPr>
+            <w:tcW w:type="dxa" w:w="2880"/>
+          </w:tcPr>
+          <w:p>
+            <w:r>
+              <w:rPr>
+                <w:sz w:val="18"/>
+              </w:rPr>
+              <w:t>...</w:t>
+            </w:r>
+          </w:p>
+        </w:tc>
+        <w:tc>
+          <w:tcPr>
+            <w:tcW w:type="dxa" w:w="2880"/>
+          </w:tcPr>
+          <w:p>
+            <w:r>
+              <w:rPr>
+                <w:sz w:val="18"/>
+              </w:rPr>
+              <w:t>...</w:t>
+            </w:r>
+          </w:p>
+        </w:tc>
+      </w:tr>
+      <w:tr>
+        <w:tc>
+          <w:tcPr>
+            <w:tcW w:type="dxa" w:w="2880"/>
+          </w:tcPr>
+          <w:p>
+            <w:r>
+              <w:rPr>
+                <w:sz w:val="18"/>
+              </w:rPr>
+              <w:t>Page 8</w:t>
+            </w:r>
+          </w:p>
+        </w:tc>
+        <w:tc>
+          <w:tcPr>
+            <w:tcW w:type="dxa" w:w="2880"/>
+          </w:tcPr>
+          <w:p>
+            <w:r>
+              <w:rPr>
+                <w:sz w:val="18"/>
+              </w:rPr>
+              <w:t>Box #1 (SN 6008)</w:t>
+            </w:r>
+          </w:p>
+        </w:tc>
+        <w:tc>
+          <w:tcPr>
+            <w:tcW w:type="dxa" w:w="2880"/>
+          </w:tcPr>
+          <w:p>
+            <w:r>
+              <w:rPr>
+                <w:sz w:val="18"/>
+              </w:rPr>
+              <w:t>Box #2 (SN 6008)</w:t>
+            </w:r>
+          </w:p>
+        </w:tc>
+      </w:tr>
+    </w:tbl>
+    <w:p>
+      <w:r>
+        <w:rPr>
+          <w:b/>
+          <w:sz w:val="20"/>
+        </w:rPr>
+        <w:t>Result: 8 pages, 16 stickers (2 per SN).</w:t>
+      </w:r>
+    </w:p>
+    <w:p>
+      <w:r>
+        <w:rPr>
+          <w:b/>
+          <w:sz w:val="20"/>
+        </w:rPr>
+        <w:t xml:space="preserve">Use this for: </w:t>
+      </w:r>
+      <w:r>
+        <w:rPr>
+          <w:sz w:val="20"/>
+        </w:rPr>
+        <w:t>Wellhead Kit Rio sticker inside pallet (Box #1 on top, Box #2 on bottom, same SN for both because they belong to the same wellhead kit).</w:t>
+      </w:r>
+    </w:p>
+    <w:p>
+      <w:pPr>
+        <w:pStyle w:val="Heading2"/>
+      </w:pPr>
+      <w:r>
+        <w:t>Mode 3: Same Serial Number on Both Halves (Multiple Copies)</w:t>
+      </w:r>
+    </w:p>
+    <w:p>
+      <w:r>
+        <w:rPr>
+          <w:b/>
+        </w:rPr>
+        <w:t xml:space="preserve">Template: </w:t>
+      </w:r>
+      <w:r>
+        <w:t>Both top and bottom halves use {SERIAL_NUMBER} (or no SN at all)</w:t>
+      </w:r>
+    </w:p>
+    <w:p>
+      <w:r>
+        <w:rPr>
+          <w:b/>
+        </w:rPr>
+        <w:t xml:space="preserve">Kit Config: </w:t>
+      </w:r>
+      <w:r>
+        <w:t>Per Page = 1 (Full Page), Copies Per SN = 2 (or more)</w:t>
+      </w:r>
+    </w:p>
+    <w:p>
+      <w:r>
+        <w:t>Same as Mode 2 but generates multiple pages per serial number. Use this when you need extra copies of the same sticker for a single unit.</w:t>
+      </w:r>
+    </w:p>
+    <w:p/>
+    <w:p>
+      <w:r>
+        <w:rPr>
+          <w:b/>
+          <w:sz w:val="20"/>
+        </w:rPr>
+        <w:t>Example with 8 serial numbers, 2 copies each:</w:t>
+      </w:r>
+    </w:p>
+    <w:tbl>
+      <w:tblPr>
+        <w:tblStyle w:val="TableGrid"/>
+        <w:tblW w:type="auto" w:w="0"/>
+        <w:tblLook w:firstColumn="1" w:firstRow="1" w:lastColumn="0" w:lastRow="0" w:noHBand="0" w:noVBand="1" w:val="04A0"/>
+      </w:tblPr>
+      <w:tblGrid>
+        <w:gridCol w:w="2880"/>
+        <w:gridCol w:w="2880"/>
+        <w:gridCol w:w="2880"/>
+      </w:tblGrid>
+      <w:tr>
+        <w:tc>
+          <w:tcPr>
+            <w:tcW w:type="dxa" w:w="2880"/>
+          </w:tcPr>
+          <w:p>
+            <w:r>
+              <w:rPr>
+                <w:b/>
+                <w:sz w:val="18"/>
+              </w:rPr>
+              <w:t>Page</w:t>
+            </w:r>
+          </w:p>
+        </w:tc>
+        <w:tc>
+          <w:tcPr>
+            <w:tcW w:type="dxa" w:w="2880"/>
+          </w:tcPr>
+          <w:p>
+            <w:r>
+              <w:rPr>
+                <w:b/>
+                <w:sz w:val="18"/>
+              </w:rPr>
+              <w:t>Top Sticker</w:t>
+            </w:r>
+          </w:p>
+        </w:tc>
+        <w:tc>
+          <w:tcPr>
+            <w:tcW w:type="dxa" w:w="2880"/>
+          </w:tcPr>
+          <w:p>
+            <w:r>
+              <w:rPr>
+                <w:b/>
+                <w:sz w:val="18"/>
+              </w:rPr>
+              <w:t>Bottom Sticker</w:t>
+            </w:r>
+          </w:p>
+        </w:tc>
+      </w:tr>
+      <w:tr>
+        <w:tc>
+          <w:tcPr>
+            <w:tcW w:type="dxa" w:w="2880"/>
+          </w:tcPr>
+          <w:p>
+            <w:r>
+              <w:rPr>
+                <w:sz w:val="18"/>
+              </w:rPr>
+              <w:t>Page 1</w:t>
+            </w:r>
+          </w:p>
+        </w:tc>
+        <w:tc>
+          <w:tcPr>
+            <w:tcW w:type="dxa" w:w="2880"/>
+          </w:tcPr>
+          <w:p>
+            <w:r>
+              <w:rPr>
+                <w:sz w:val="18"/>
+              </w:rPr>
+              <w:t>SN 6001 (copy 1)</w:t>
+            </w:r>
+          </w:p>
+        </w:tc>
+        <w:tc>
+          <w:tcPr>
+            <w:tcW w:type="dxa" w:w="2880"/>
+          </w:tcPr>
+          <w:p>
+            <w:r>
+              <w:rPr>
+                <w:sz w:val="18"/>
+              </w:rPr>
+              <w:t>SN 6001 (copy 1)</w:t>
+            </w:r>
+          </w:p>
+        </w:tc>
+      </w:tr>
+      <w:tr>
+        <w:tc>
+          <w:tcPr>
+            <w:tcW w:type="dxa" w:w="2880"/>
+          </w:tcPr>
+          <w:p>
+            <w:r>
+              <w:rPr>
+                <w:sz w:val="18"/>
+              </w:rPr>
+              <w:t>Page 2</w:t>
+            </w:r>
+          </w:p>
+        </w:tc>
+        <w:tc>
+          <w:tcPr>
+            <w:tcW w:type="dxa" w:w="2880"/>
+          </w:tcPr>
+          <w:p>
+            <w:r>
+              <w:rPr>
+                <w:sz w:val="18"/>
+              </w:rPr>
+              <w:t>SN 6001 (copy 2)</w:t>
+            </w:r>
+          </w:p>
+        </w:tc>
+        <w:tc>
+          <w:tcPr>
+            <w:tcW w:type="dxa" w:w="2880"/>
+          </w:tcPr>
+          <w:p>
+            <w:r>
+              <w:rPr>
+                <w:sz w:val="18"/>
+              </w:rPr>
+              <w:t>SN 6001 (copy 2)</w:t>
+            </w:r>
+          </w:p>
+        </w:tc>
+      </w:tr>
+      <w:tr>
+        <w:tc>
+          <w:tcPr>
+            <w:tcW w:type="dxa" w:w="2880"/>
+          </w:tcPr>
+          <w:p>
+            <w:r>
+              <w:rPr>
+                <w:sz w:val="18"/>
+              </w:rPr>
+              <w:t>Page 3</w:t>
+            </w:r>
+          </w:p>
+        </w:tc>
+        <w:tc>
+          <w:tcPr>
+            <w:tcW w:type="dxa" w:w="2880"/>
+          </w:tcPr>
+          <w:p>
+            <w:r>
+              <w:rPr>
+                <w:sz w:val="18"/>
+              </w:rPr>
+              <w:t>SN 6002 (copy 1)</w:t>
+            </w:r>
+          </w:p>
+        </w:tc>
+        <w:tc>
+          <w:tcPr>
+            <w:tcW w:type="dxa" w:w="2880"/>
+          </w:tcPr>
+          <w:p>
+            <w:r>
+              <w:rPr>
+                <w:sz w:val="18"/>
+              </w:rPr>
+              <w:t>SN 6002 (copy 1)</w:t>
+            </w:r>
+          </w:p>
+        </w:tc>
+      </w:tr>
+      <w:tr>
+        <w:tc>
+          <w:tcPr>
+            <w:tcW w:type="dxa" w:w="2880"/>
+          </w:tcPr>
+          <w:p>
+            <w:r>
+              <w:rPr>
+                <w:sz w:val="18"/>
+              </w:rPr>
+              <w:t>Page 4</w:t>
+            </w:r>
+          </w:p>
+        </w:tc>
+        <w:tc>
+          <w:tcPr>
+            <w:tcW w:type="dxa" w:w="2880"/>
+          </w:tcPr>
+          <w:p>
+            <w:r>
+              <w:rPr>
+                <w:sz w:val="18"/>
+              </w:rPr>
+              <w:t>SN 6002 (copy 2)</w:t>
+            </w:r>
+          </w:p>
+        </w:tc>
+        <w:tc>
+          <w:tcPr>
+            <w:tcW w:type="dxa" w:w="2880"/>
+          </w:tcPr>
+          <w:p>
+            <w:r>
+              <w:rPr>
+                <w:sz w:val="18"/>
+              </w:rPr>
+              <w:t>SN 6002 (copy 2)</w:t>
+            </w:r>
+          </w:p>
+        </w:tc>
+      </w:tr>
+      <w:tr>
+        <w:tc>
+          <w:tcPr>
+            <w:tcW w:type="dxa" w:w="2880"/>
+          </w:tcPr>
+          <w:p>
+            <w:r>
+              <w:rPr>
+                <w:sz w:val="18"/>
+              </w:rPr>
+              <w:t>...and so on through SN 6008</w:t>
+            </w:r>
+          </w:p>
+        </w:tc>
+        <w:tc>
+          <w:tcPr>
+            <w:tcW w:type="dxa" w:w="2880"/>
+          </w:tcPr>
+          <w:p>
+            <w:r>
+              <w:rPr>
+                <w:sz w:val="18"/>
+              </w:rPr>
+            </w:r>
+          </w:p>
+        </w:tc>
+        <w:tc>
+          <w:tcPr>
+            <w:tcW w:type="dxa" w:w="2880"/>
+          </w:tcPr>
+          <w:p>
+            <w:r>
+              <w:rPr>
+                <w:sz w:val="18"/>
+              </w:rPr>
+            </w:r>
+          </w:p>
+        </w:tc>
+      </w:tr>
+    </w:tbl>
+    <w:p>
+      <w:r>
+        <w:rPr>
+          <w:b/>
+          <w:sz w:val="20"/>
+        </w:rPr>
+        <w:t>Result: 16 pages, 32 stickers (4 per SN).</w:t>
+      </w:r>
+    </w:p>
+    <w:p>
+      <w:r>
+        <w:rPr>
+          <w:b/>
+          <w:sz w:val="20"/>
+        </w:rPr>
+        <w:t xml:space="preserve">Use this for: </w:t>
+      </w:r>
+      <w:r>
+        <w:rPr>
+          <w:sz w:val="20"/>
+        </w:rPr>
+        <w:t>Wellhead Kit Stateline pallet wrap (need multiple copies of the same sticker to wrap around the pallet from different angles).</w:t>
+      </w:r>
+    </w:p>
+    <w:p>
+      <w:pPr>
+        <w:pStyle w:val="Heading2"/>
+      </w:pPr>
+      <w:r>
+        <w:t>Quick Reference: Mode Selection</w:t>
+      </w:r>
+    </w:p>
+    <w:tbl>
+      <w:tblPr>
+        <w:tblStyle w:val="TableGrid"/>
+        <w:tblW w:type="auto" w:w="0"/>
+        <w:tblLook w:firstColumn="1" w:firstRow="1" w:lastColumn="0" w:lastRow="0" w:noHBand="0" w:noVBand="1" w:val="04A0"/>
+      </w:tblPr>
+      <w:tblGrid>
+        <w:gridCol w:w="1728"/>
+        <w:gridCol w:w="1728"/>
+        <w:gridCol w:w="1728"/>
+        <w:gridCol w:w="1728"/>
+        <w:gridCol w:w="1728"/>
+      </w:tblGrid>
+      <w:tr>
+        <w:tc>
+          <w:tcPr>
+            <w:tcW w:type="dxa" w:w="1728"/>
+          </w:tcPr>
+          <w:p>
+            <w:r>
+              <w:rPr>
+                <w:b/>
+                <w:sz w:val="18"/>
+              </w:rPr>
+              <w:t>Mode</w:t>
+            </w:r>
+          </w:p>
+        </w:tc>
+        <w:tc>
+          <w:tcPr>
+            <w:tcW w:type="dxa" w:w="1728"/>
+          </w:tcPr>
+          <w:p>
+            <w:r>
+              <w:rPr>
+                <w:b/>
+                <w:sz w:val="18"/>
+              </w:rPr>
+              <w:t>Top Half</w:t>
+            </w:r>
+          </w:p>
+        </w:tc>
+        <w:tc>
+          <w:tcPr>
+            <w:tcW w:type="dxa" w:w="1728"/>
+          </w:tcPr>
+          <w:p>
+            <w:r>
+              <w:rPr>
+                <w:b/>
+                <w:sz w:val="18"/>
+              </w:rPr>
+              <w:t>Bottom Half</w:t>
+            </w:r>
+          </w:p>
+        </w:tc>
+        <w:tc>
+          <w:tcPr>
+            <w:tcW w:type="dxa" w:w="1728"/>
+          </w:tcPr>
+          <w:p>
+            <w:r>
+              <w:rPr>
+                <w:b/>
+                <w:sz w:val="18"/>
+              </w:rPr>
+              <w:t>Per Page</w:t>
+            </w:r>
+          </w:p>
+        </w:tc>
+        <w:tc>
+          <w:tcPr>
+            <w:tcW w:type="dxa" w:w="1728"/>
+          </w:tcPr>
+          <w:p>
+            <w:r>
+              <w:rPr>
+                <w:b/>
+                <w:sz w:val="18"/>
+              </w:rPr>
+              <w:t>Copies/SN</w:t>
+            </w:r>
+          </w:p>
+        </w:tc>
+      </w:tr>
+      <w:tr>
+        <w:tc>
+          <w:tcPr>
+            <w:tcW w:type="dxa" w:w="1728"/>
+          </w:tcPr>
+          <w:p>
+            <w:r>
+              <w:rPr>
+                <w:sz w:val="18"/>
+              </w:rPr>
+              <w:t>Different SNs</w:t>
+            </w:r>
+          </w:p>
+        </w:tc>
+        <w:tc>
+          <w:tcPr>
+            <w:tcW w:type="dxa" w:w="1728"/>
+          </w:tcPr>
+          <w:p>
+            <w:r>
+              <w:rPr>
+                <w:sz w:val="18"/>
+              </w:rPr>
+              <w:t>{SERIAL_NUMBER}</w:t>
+            </w:r>
+          </w:p>
+        </w:tc>
+        <w:tc>
+          <w:tcPr>
+            <w:tcW w:type="dxa" w:w="1728"/>
+          </w:tcPr>
+          <w:p>
+            <w:r>
+              <w:rPr>
+                <w:sz w:val="18"/>
+              </w:rPr>
+              <w:t>{SERIAL_NUMBER_2}</w:t>
+            </w:r>
+          </w:p>
+        </w:tc>
+        <w:tc>
+          <w:tcPr>
+            <w:tcW w:type="dxa" w:w="1728"/>
+          </w:tcPr>
+          <w:p>
+            <w:r>
+              <w:rPr>
+                <w:sz w:val="18"/>
+              </w:rPr>
+              <w:t>2 (Half)</w:t>
+            </w:r>
+          </w:p>
+        </w:tc>
+        <w:tc>
+          <w:tcPr>
+            <w:tcW w:type="dxa" w:w="1728"/>
+          </w:tcPr>
+          <w:p>
+            <w:r>
+              <w:rPr>
+                <w:sz w:val="18"/>
+              </w:rPr>
+              <w:t>1</w:t>
+            </w:r>
+          </w:p>
+        </w:tc>
+      </w:tr>
+      <w:tr>
+        <w:tc>
+          <w:tcPr>
+            <w:tcW w:type="dxa" w:w="1728"/>
+          </w:tcPr>
+          <w:p>
+            <w:r>
+              <w:rPr>
+                <w:sz w:val="18"/>
+              </w:rPr>
+              <w:t>Same SN</w:t>
+            </w:r>
+          </w:p>
+        </w:tc>
+        <w:tc>
+          <w:tcPr>
+            <w:tcW w:type="dxa" w:w="1728"/>
+          </w:tcPr>
+          <w:p>
+            <w:r>
+              <w:rPr>
+                <w:sz w:val="18"/>
+              </w:rPr>
+              <w:t>{SERIAL_NUMBER}</w:t>
+            </w:r>
+          </w:p>
+        </w:tc>
+        <w:tc>
+          <w:tcPr>
+            <w:tcW w:type="dxa" w:w="1728"/>
+          </w:tcPr>
+          <w:p>
+            <w:r>
+              <w:rPr>
+                <w:sz w:val="18"/>
+              </w:rPr>
+              <w:t>{SERIAL_NUMBER}</w:t>
+            </w:r>
+          </w:p>
+        </w:tc>
+        <w:tc>
+          <w:tcPr>
+            <w:tcW w:type="dxa" w:w="1728"/>
+          </w:tcPr>
+          <w:p>
+            <w:r>
+              <w:rPr>
+                <w:sz w:val="18"/>
+              </w:rPr>
+              <w:t>1 (Full)</w:t>
+            </w:r>
+          </w:p>
+        </w:tc>
+        <w:tc>
+          <w:tcPr>
+            <w:tcW w:type="dxa" w:w="1728"/>
+          </w:tcPr>
+          <w:p>
+            <w:r>
+              <w:rPr>
+                <w:sz w:val="18"/>
+              </w:rPr>
+              <w:t>1</w:t>
+            </w:r>
+          </w:p>
+        </w:tc>
+      </w:tr>
+      <w:tr>
+        <w:tc>
+          <w:tcPr>
+            <w:tcW w:type="dxa" w:w="1728"/>
+          </w:tcPr>
+          <w:p>
+            <w:r>
+              <w:rPr>
+                <w:sz w:val="18"/>
+              </w:rPr>
+              <w:t>Same SN + copies</w:t>
+            </w:r>
+          </w:p>
+        </w:tc>
+        <w:tc>
+          <w:tcPr>
+            <w:tcW w:type="dxa" w:w="1728"/>
+          </w:tcPr>
+          <w:p>
+            <w:r>
+              <w:rPr>
+                <w:sz w:val="18"/>
+              </w:rPr>
+              <w:t>{SERIAL_NUMBER}</w:t>
+            </w:r>
+          </w:p>
+        </w:tc>
+        <w:tc>
+          <w:tcPr>
+            <w:tcW w:type="dxa" w:w="1728"/>
+          </w:tcPr>
+          <w:p>
+            <w:r>
+              <w:rPr>
+                <w:sz w:val="18"/>
+              </w:rPr>
+              <w:t>{SERIAL_NUMBER}</w:t>
+            </w:r>
+          </w:p>
+        </w:tc>
+        <w:tc>
+          <w:tcPr>
+            <w:tcW w:type="dxa" w:w="1728"/>
+          </w:tcPr>
+          <w:p>
+            <w:r>
+              <w:rPr>
+                <w:sz w:val="18"/>
+              </w:rPr>
+              <w:t>1 (Full)</w:t>
+            </w:r>
+          </w:p>
+        </w:tc>
+        <w:tc>
+          <w:tcPr>
+            <w:tcW w:type="dxa" w:w="1728"/>
+          </w:tcPr>
+          <w:p>
+            <w:r>
+              <w:rPr>
+                <w:sz w:val="18"/>
+              </w:rPr>
+              <w:t>2+</w:t>
             </w:r>
           </w:p>
         </w:tc>
@@ -772,7 +2185,7 @@
     </w:p>
     <w:p>
       <w:r>
-        <w:t>Create a table with 1 column and either 1 row (full page) or 2 rows (half sheet). Set each row height to Exact: 5.15" for half-sheet or 10.3" for full page. Remove all table borders. Set vertical alignment to Center.</w:t>
+        <w:t>Create a table with 1 column and 2 rows. Set each row height to Exact: 5.15". Remove all table borders. Set vertical alignment to Center.</w:t>
       </w:r>
     </w:p>
     <w:p>
@@ -780,22 +2193,41 @@
         <w:pStyle w:val="Heading2"/>
       </w:pPr>
       <w:r>
-        <w:t>Step 3: Add content with placeholders</w:t>
+        <w:t>Step 3: Decide which serial number mode you need</w:t>
+      </w:r>
+    </w:p>
+    <w:p>
+      <w:r>
+        <w:t>If top and bottom are for DIFFERENT serial numbers: use {SERIAL_NUMBER} on top and {SERIAL_NUMBER_2} on bottom. Set Per Page = 2 in the kit config rule.</w:t>
+        <w:br/>
+        <w:t>If top and bottom are for the SAME serial number: use {SERIAL_NUMBER} on both halves. Set Per Page = 1 in the kit config rule.</w:t>
+        <w:br/>
+        <w:t>If you need multiple copies: set Copies Per SN = 2 or more.</w:t>
+      </w:r>
+    </w:p>
+    <w:p>
+      <w:pPr>
+        <w:pStyle w:val="Heading2"/>
+      </w:pPr>
+      <w:r>
+        <w:t>Step 4: Add content with placeholders</w:t>
       </w:r>
     </w:p>
     <w:p>
       <w:r>
         <w:t>Type your sticker content in each cell, replacing variable values with placeholders:</w:t>
         <w:br/>
-        <w:t xml:space="preserve">  • Replace "6062" with {SERIAL_NUMBER}</w:t>
+        <w:t xml:space="preserve">  • Replace serial numbers with {SERIAL_NUMBER} or {SERIAL_NUMBER_2}</w:t>
         <w:br/>
-        <w:t xml:space="preserve">  • Replace "CC-175431.AL.FAC" with {WBS}</w:t>
+        <w:t xml:space="preserve">  • Replace WBS numbers with {WBS}</w:t>
         <w:br/>
-        <w:t xml:space="preserve">  • Replace "Belloq 11 CTB 3" with {FACILITY_NAME}</w:t>
+        <w:t xml:space="preserve">  • Replace facility names with {FACILITY_NAME}</w:t>
         <w:br/>
         <w:t xml:space="preserve">  • Replace "DEVON OWNED" with {OWNERSHIP_TEXT}</w:t>
         <w:br/>
         <w:t xml:space="preserve">  • Replace equipment names with {EQUIPMENT_NAME}</w:t>
+        <w:br/>
+        <w:t xml:space="preserve">  • Replace wellhead quantities with {WELLHEAD_QTY}</w:t>
         <w:br/>
         <w:t>Keep static text (like part numbers) as-is.</w:t>
       </w:r>
@@ -805,7 +2237,7 @@
         <w:pStyle w:val="Heading2"/>
       </w:pPr>
       <w:r>
-        <w:t>Step 4: Save the file as .docx</w:t>
+        <w:t>Step 5: Save the file as .docx</w:t>
       </w:r>
     </w:p>
     <w:p>
@@ -818,7 +2250,7 @@
         <w:pStyle w:val="Heading2"/>
       </w:pPr>
       <w:r>
-        <w:t>Step 5: Upload to the Template Library</w:t>
+        <w:t>Step 6: Upload to the Template Library</w:t>
       </w:r>
     </w:p>
     <w:p>
@@ -831,7 +2263,7 @@
         <w:pStyle w:val="Heading2"/>
       </w:pPr>
       <w:r>
-        <w:t>Step 6: Verify the placeholders</w:t>
+        <w:t>Step 7: Verify the placeholders</w:t>
       </w:r>
     </w:p>
     <w:p>
@@ -844,46 +2276,18 @@
         <w:pStyle w:val="Heading2"/>
       </w:pPr>
       <w:r>
-        <w:t>Step 7: Assign to a Kit Configuration</w:t>
+        <w:t>Step 8: Assign to a Kit Configuration</w:t>
       </w:r>
     </w:p>
     <w:p>
       <w:r>
-        <w:t>Go to Common Shipping Packages, edit (or create) a kit configuration, and add a rule. In the Template dropdown, your library template will appear under "Library Templates". Select it, set copies per SN, per page layout, and other rule options.</w:t>
-      </w:r>
-    </w:p>
-    <w:p>
-      <w:pPr>
-        <w:pStyle w:val="Heading1"/>
-      </w:pPr>
-      <w:r>
-        <w:t>Full Page vs. 2-Up (Half Page) Layout</w:t>
-      </w:r>
-    </w:p>
-    <w:p>
-      <w:pPr>
-        <w:pStyle w:val="Heading2"/>
-      </w:pPr>
-      <w:r>
-        <w:t>Full Page (Per Page = 1)</w:t>
-      </w:r>
-    </w:p>
-    <w:p>
-      <w:r>
-        <w:t>One serial number per document. Use {SERIAL_NUMBER} for the SN. The system generates one DOCX file per serial number per copy. Use a 1-row table at 10.3" height.</w:t>
-      </w:r>
-    </w:p>
-    <w:p>
-      <w:pPr>
-        <w:pStyle w:val="Heading2"/>
-      </w:pPr>
-      <w:r>
-        <w:t>Half Page / 2-Up (Per Page = 2)</w:t>
-      </w:r>
-    </w:p>
-    <w:p>
-      <w:r>
-        <w:t>Two serial numbers per document. Use {SERIAL_NUMBER} for the first SN (top label) and {SERIAL_NUMBER_2} for the second SN (bottom label). The system pairs consecutive serial numbers and generates one DOCX per pair. If there's an odd number of serials, the last page will have the second SN blank. Use a 2-row table at 5.15" per row.</w:t>
+        <w:t>Go to Common Shipping Packages, edit (or create) a kit configuration, and add a rule. In the Template dropdown, your library template will appear under "Library Templates". Select it and set:</w:t>
+        <w:br/>
+        <w:t xml:space="preserve">  • Per Page = 2 for different SNs per half (Mode 1)</w:t>
+        <w:br/>
+        <w:t xml:space="preserve">  • Per Page = 1 for same SN both halves (Mode 2 or 3)</w:t>
+        <w:br/>
+        <w:t xml:space="preserve">  • Copies Per SN = number of pages per serial number</w:t>
       </w:r>
     </w:p>
     <w:p>
@@ -896,7 +2300,7 @@
     </w:p>
     <w:p>
       <w:r>
-        <w:t>When generating a shipping package, you fill in these fields. Their values replace the corresponding placeholders in every sticker template:</w:t>
+        <w:t>When generating a shipping package, you fill in these fields. Their values replace the corresponding placeholders in every sticker template. All fields have a dropdown that remembers previously used values for quick reuse.</w:t>
       </w:r>
     </w:p>
     <w:tbl>
@@ -1169,7 +2573,7 @@
               <w:rPr>
                 <w:sz w:val="18"/>
               </w:rPr>
-              <w:t>Serial Numbers</w:t>
+              <w:t>Wellhead Qty</w:t>
             </w:r>
           </w:p>
         </w:tc>
@@ -1182,7 +2586,7 @@
               <w:rPr>
                 <w:sz w:val="18"/>
               </w:rPr>
-              <w:t>{SERIAL_NUMBER}</w:t>
+              <w:t>{WELLHEAD_QTY}</w:t>
             </w:r>
           </w:p>
         </w:tc>
@@ -1195,28 +2599,32 @@
               <w:rPr>
                 <w:sz w:val="18"/>
               </w:rPr>
-              <w:t>Entered in the serial numbers text area, one per line</w:t>
+              <w:t>Number of wellheads (e.g., 1, 2, 3, 4)</w:t>
             </w:r>
           </w:p>
         </w:tc>
       </w:tr>
+      <w:tr>
+        <w:tc>
+          <w:tcPr>
+            <w:tcW w:type="dxa" w:w="2880"/>
+          </w:tcPr>
+          <w:p/>
+        </w:tc>
+        <w:tc>
+          <w:tcPr>
+            <w:tcW w:type="dxa" w:w="2880"/>
+          </w:tcPr>
+          <w:p/>
+        </w:tc>
+        <w:tc>
+          <w:tcPr>
+            <w:tcW w:type="dxa" w:w="2880"/>
+          </w:tcPr>
+          <w:p/>
+        </w:tc>
+      </w:tr>
     </w:tbl>
-    <w:p/>
-    <w:p>
-      <w:r>
-        <w:rPr>
-          <w:b/>
-          <w:sz w:val="20"/>
-        </w:rPr>
-        <w:t xml:space="preserve">Note: </w:t>
-      </w:r>
-      <w:r>
-        <w:rPr>
-          <w:sz w:val="20"/>
-        </w:rPr>
-        <w:t>All fields have a dropdown arrow that shows previously used values for quick reuse. The system remembers your inputs automatically.</w:t>
-      </w:r>
-    </w:p>
     <w:p>
       <w:pPr>
         <w:pStyle w:val="Heading1"/>
@@ -1375,11 +2783,6 @@
         <w:t>Provided Sample Templates</w:t>
       </w:r>
     </w:p>
-    <w:p>
-      <w:r>
-        <w:t>The following ready-to-upload templates are included in the Template_Library_Samples folder:</w:t>
-      </w:r>
-    </w:p>
     <w:tbl>
       <w:tblPr>
         <w:tblStyle w:val="TableGrid"/>
@@ -1387,15 +2790,16 @@
         <w:tblLook w:firstColumn="1" w:firstRow="1" w:lastColumn="0" w:lastRow="0" w:noHBand="0" w:noVBand="1" w:val="04A0"/>
       </w:tblPr>
       <w:tblGrid>
-        <w:gridCol w:w="2160"/>
-        <w:gridCol w:w="2160"/>
-        <w:gridCol w:w="2160"/>
-        <w:gridCol w:w="2160"/>
+        <w:gridCol w:w="1728"/>
+        <w:gridCol w:w="1728"/>
+        <w:gridCol w:w="1728"/>
+        <w:gridCol w:w="1728"/>
+        <w:gridCol w:w="1728"/>
       </w:tblGrid>
       <w:tr>
         <w:tc>
           <w:tcPr>
-            <w:tcW w:type="dxa" w:w="2160"/>
+            <w:tcW w:type="dxa" w:w="1728"/>
           </w:tcPr>
           <w:p>
             <w:r>
@@ -1409,7 +2813,7 @@
         </w:tc>
         <w:tc>
           <w:tcPr>
-            <w:tcW w:type="dxa" w:w="2160"/>
+            <w:tcW w:type="dxa" w:w="1728"/>
           </w:tcPr>
           <w:p>
             <w:r>
@@ -1417,13 +2821,13 @@
                 <w:b/>
                 <w:sz w:val="16"/>
               </w:rPr>
-              <w:t>Layout</w:t>
+              <w:t>SN Mode</w:t>
             </w:r>
           </w:p>
         </w:tc>
         <w:tc>
           <w:tcPr>
-            <w:tcW w:type="dxa" w:w="2160"/>
+            <w:tcW w:type="dxa" w:w="1728"/>
           </w:tcPr>
           <w:p>
             <w:r>
@@ -1431,13 +2835,13 @@
                 <w:b/>
                 <w:sz w:val="16"/>
               </w:rPr>
-              <w:t>Sticker(s)</w:t>
+              <w:t>Per Page</w:t>
             </w:r>
           </w:p>
         </w:tc>
         <w:tc>
           <w:tcPr>
-            <w:tcW w:type="dxa" w:w="2160"/>
+            <w:tcW w:type="dxa" w:w="1728"/>
           </w:tcPr>
           <w:p>
             <w:r>
@@ -1445,7 +2849,21 @@
                 <w:b/>
                 <w:sz w:val="16"/>
               </w:rPr>
-              <w:t>Placeholders</w:t>
+              <w:t>Copies</w:t>
+            </w:r>
+          </w:p>
+        </w:tc>
+        <w:tc>
+          <w:tcPr>
+            <w:tcW w:type="dxa" w:w="1728"/>
+          </w:tcPr>
+          <w:p>
+            <w:r>
+              <w:rPr>
+                <w:b/>
+                <w:sz w:val="16"/>
+              </w:rPr>
+              <w:t>Description</w:t>
             </w:r>
           </w:p>
         </w:tc>
@@ -1453,33 +2871,59 @@
       <w:tr>
         <w:tc>
           <w:tcPr>
-            <w:tcW w:type="dxa" w:w="2160"/>
+            <w:tcW w:type="dxa" w:w="1728"/>
           </w:tcPr>
           <w:p>
             <w:r>
               <w:rPr>
                 <w:sz w:val="16"/>
               </w:rPr>
-              <w:t>Cable_Sticker_Template_v3.docx</w:t>
+              <w:t>Cable_Sticker_Template_v3</w:t>
             </w:r>
           </w:p>
         </w:tc>
         <w:tc>
           <w:tcPr>
-            <w:tcW w:type="dxa" w:w="2160"/>
+            <w:tcW w:type="dxa" w:w="1728"/>
           </w:tcPr>
           <w:p>
             <w:r>
               <w:rPr>
                 <w:sz w:val="16"/>
               </w:rPr>
-              <w:t>2-up</w:t>
+              <w:t>Same SN</w:t>
             </w:r>
           </w:p>
         </w:tc>
         <w:tc>
           <w:tcPr>
-            <w:tcW w:type="dxa" w:w="2160"/>
+            <w:tcW w:type="dxa" w:w="1728"/>
+          </w:tcPr>
+          <w:p>
+            <w:r>
+              <w:rPr>
+                <w:sz w:val="16"/>
+              </w:rPr>
+              <w:t>1</w:t>
+            </w:r>
+          </w:p>
+        </w:tc>
+        <w:tc>
+          <w:tcPr>
+            <w:tcW w:type="dxa" w:w="1728"/>
+          </w:tcPr>
+          <w:p>
+            <w:r>
+              <w:rPr>
+                <w:sz w:val="16"/>
+              </w:rPr>
+              <w:t>1</w:t>
+            </w:r>
+          </w:p>
+        </w:tc>
+        <w:tc>
+          <w:tcPr>
+            <w:tcW w:type="dxa" w:w="1728"/>
           </w:tcPr>
           <w:p>
             <w:r>
@@ -1490,16 +2934,70 @@
             </w:r>
           </w:p>
         </w:tc>
+      </w:tr>
+      <w:tr>
         <w:tc>
           <w:tcPr>
-            <w:tcW w:type="dxa" w:w="2160"/>
+            <w:tcW w:type="dxa" w:w="1728"/>
           </w:tcPr>
           <w:p>
             <w:r>
               <w:rPr>
                 <w:sz w:val="16"/>
               </w:rPr>
-              <w:t>OWNERSHIP, SN, FACILITY, WBS</w:t>
+              <w:t>Equipment_Label_2UP_Template_v2</w:t>
+            </w:r>
+          </w:p>
+        </w:tc>
+        <w:tc>
+          <w:tcPr>
+            <w:tcW w:type="dxa" w:w="1728"/>
+          </w:tcPr>
+          <w:p>
+            <w:r>
+              <w:rPr>
+                <w:sz w:val="16"/>
+              </w:rPr>
+              <w:t>Diff SNs</w:t>
+            </w:r>
+          </w:p>
+        </w:tc>
+        <w:tc>
+          <w:tcPr>
+            <w:tcW w:type="dxa" w:w="1728"/>
+          </w:tcPr>
+          <w:p>
+            <w:r>
+              <w:rPr>
+                <w:sz w:val="16"/>
+              </w:rPr>
+              <w:t>2</w:t>
+            </w:r>
+          </w:p>
+        </w:tc>
+        <w:tc>
+          <w:tcPr>
+            <w:tcW w:type="dxa" w:w="1728"/>
+          </w:tcPr>
+          <w:p>
+            <w:r>
+              <w:rPr>
+                <w:sz w:val="16"/>
+              </w:rPr>
+              <w:t>1</w:t>
+            </w:r>
+          </w:p>
+        </w:tc>
+        <w:tc>
+          <w:tcPr>
+            <w:tcW w:type="dxa" w:w="1728"/>
+          </w:tcPr>
+          <w:p>
+            <w:r>
+              <w:rPr>
+                <w:sz w:val="16"/>
+              </w:rPr>
+              <w:t>Generic label with {EQUIPMENT_NAME}, pairs SNs</w:t>
             </w:r>
           </w:p>
         </w:tc>
@@ -1507,53 +3005,66 @@
       <w:tr>
         <w:tc>
           <w:tcPr>
-            <w:tcW w:type="dxa" w:w="2160"/>
+            <w:tcW w:type="dxa" w:w="1728"/>
           </w:tcPr>
           <w:p>
             <w:r>
               <w:rPr>
                 <w:sz w:val="16"/>
               </w:rPr>
-              <w:t>Equipment_Label_2UP_Template_v2.docx</w:t>
+              <w:t>Rio sticker inside pallet #1</w:t>
             </w:r>
           </w:p>
         </w:tc>
         <w:tc>
           <w:tcPr>
-            <w:tcW w:type="dxa" w:w="2160"/>
+            <w:tcW w:type="dxa" w:w="1728"/>
           </w:tcPr>
           <w:p>
             <w:r>
               <w:rPr>
                 <w:sz w:val="16"/>
               </w:rPr>
-              <w:t>2-up</w:t>
+              <w:t>Same SN</w:t>
             </w:r>
           </w:p>
         </w:tc>
         <w:tc>
           <w:tcPr>
-            <w:tcW w:type="dxa" w:w="2160"/>
+            <w:tcW w:type="dxa" w:w="1728"/>
           </w:tcPr>
           <w:p>
             <w:r>
               <w:rPr>
                 <w:sz w:val="16"/>
               </w:rPr>
-              <w:t>Generic equipment label (uses EQUIPMENT_NAME)</w:t>
+              <w:t>1</w:t>
             </w:r>
           </w:p>
         </w:tc>
         <w:tc>
           <w:tcPr>
-            <w:tcW w:type="dxa" w:w="2160"/>
+            <w:tcW w:type="dxa" w:w="1728"/>
           </w:tcPr>
           <w:p>
             <w:r>
               <w:rPr>
                 <w:sz w:val="16"/>
               </w:rPr>
-              <w:t>OWNERSHIP, SN, SN_2, FACILITY, WBS, EQUIP</w:t>
+              <w:t>1</w:t>
+            </w:r>
+          </w:p>
+        </w:tc>
+        <w:tc>
+          <w:tcPr>
+            <w:tcW w:type="dxa" w:w="1728"/>
+          </w:tcPr>
+          <w:p>
+            <w:r>
+              <w:rPr>
+                <w:sz w:val="16"/>
+              </w:rPr>
+              <w:t>Box #1 (top) + Box #2 (bottom), same SN</w:t>
             </w:r>
           </w:p>
         </w:tc>
@@ -1561,53 +3072,66 @@
       <w:tr>
         <w:tc>
           <w:tcPr>
-            <w:tcW w:type="dxa" w:w="2160"/>
+            <w:tcW w:type="dxa" w:w="1728"/>
           </w:tcPr>
           <w:p>
             <w:r>
               <w:rPr>
                 <w:sz w:val="16"/>
               </w:rPr>
-              <w:t>Rio sticker inside pallet #1.docx</w:t>
+              <w:t>RIO Sticker RIO-520 - Box</w:t>
             </w:r>
           </w:p>
         </w:tc>
         <w:tc>
           <w:tcPr>
-            <w:tcW w:type="dxa" w:w="2160"/>
+            <w:tcW w:type="dxa" w:w="1728"/>
           </w:tcPr>
           <w:p>
             <w:r>
               <w:rPr>
                 <w:sz w:val="16"/>
               </w:rPr>
-              <w:t>2-up</w:t>
+              <w:t>Same SN</w:t>
             </w:r>
           </w:p>
         </w:tc>
         <w:tc>
           <w:tcPr>
-            <w:tcW w:type="dxa" w:w="2160"/>
+            <w:tcW w:type="dxa" w:w="1728"/>
           </w:tcPr>
           <w:p>
             <w:r>
               <w:rPr>
                 <w:sz w:val="16"/>
               </w:rPr>
-              <w:t>Box #1 (top) + Box #2 (bottom)</w:t>
+              <w:t>1</w:t>
             </w:r>
           </w:p>
         </w:tc>
         <w:tc>
           <w:tcPr>
-            <w:tcW w:type="dxa" w:w="2160"/>
+            <w:tcW w:type="dxa" w:w="1728"/>
           </w:tcPr>
           <w:p>
             <w:r>
               <w:rPr>
                 <w:sz w:val="16"/>
               </w:rPr>
-              <w:t>OWNERSHIP, SN, FACILITY, WBS</w:t>
+              <w:t>1</w:t>
+            </w:r>
+          </w:p>
+        </w:tc>
+        <w:tc>
+          <w:tcPr>
+            <w:tcW w:type="dxa" w:w="1728"/>
+          </w:tcPr>
+          <w:p>
+            <w:r>
+              <w:rPr>
+                <w:sz w:val="16"/>
+              </w:rPr>
+              <w:t>Two identical RIO-520 box stickers</w:t>
             </w:r>
           </w:p>
         </w:tc>
@@ -1615,53 +3139,66 @@
       <w:tr>
         <w:tc>
           <w:tcPr>
-            <w:tcW w:type="dxa" w:w="2160"/>
+            <w:tcW w:type="dxa" w:w="1728"/>
           </w:tcPr>
           <w:p>
             <w:r>
               <w:rPr>
                 <w:sz w:val="16"/>
               </w:rPr>
-              <w:t>RIO Sticker RIO-520 - Box.docx</w:t>
+              <w:t>RIO Sticker RIO-520 - Pallet</w:t>
             </w:r>
           </w:p>
         </w:tc>
         <w:tc>
           <w:tcPr>
-            <w:tcW w:type="dxa" w:w="2160"/>
+            <w:tcW w:type="dxa" w:w="1728"/>
           </w:tcPr>
           <w:p>
             <w:r>
               <w:rPr>
                 <w:sz w:val="16"/>
               </w:rPr>
-              <w:t>Full page</w:t>
+              <w:t>Same SN</w:t>
             </w:r>
           </w:p>
         </w:tc>
         <w:tc>
           <w:tcPr>
-            <w:tcW w:type="dxa" w:w="2160"/>
+            <w:tcW w:type="dxa" w:w="1728"/>
           </w:tcPr>
           <w:p>
             <w:r>
               <w:rPr>
                 <w:sz w:val="16"/>
               </w:rPr>
-              <w:t>Single RIO-520 box sticker</w:t>
+              <w:t>1</w:t>
             </w:r>
           </w:p>
         </w:tc>
         <w:tc>
           <w:tcPr>
-            <w:tcW w:type="dxa" w:w="2160"/>
+            <w:tcW w:type="dxa" w:w="1728"/>
           </w:tcPr>
           <w:p>
             <w:r>
               <w:rPr>
                 <w:sz w:val="16"/>
               </w:rPr>
-              <w:t>OWNERSHIP, SN, FACILITY, WBS</w:t>
+              <w:t>1</w:t>
+            </w:r>
+          </w:p>
+        </w:tc>
+        <w:tc>
+          <w:tcPr>
+            <w:tcW w:type="dxa" w:w="1728"/>
+          </w:tcPr>
+          <w:p>
+            <w:r>
+              <w:rPr>
+                <w:sz w:val="16"/>
+              </w:rPr>
+              <w:t>Two identical RIO-520 pallet stickers</w:t>
             </w:r>
           </w:p>
         </w:tc>
@@ -1669,53 +3206,66 @@
       <w:tr>
         <w:tc>
           <w:tcPr>
-            <w:tcW w:type="dxa" w:w="2160"/>
+            <w:tcW w:type="dxa" w:w="1728"/>
           </w:tcPr>
           <w:p>
             <w:r>
               <w:rPr>
                 <w:sz w:val="16"/>
               </w:rPr>
-              <w:t>RIO Sticker RIO-520 - Pallet.docx</w:t>
+              <w:t>RIO Stickers #1-on pallet wrap</w:t>
             </w:r>
           </w:p>
         </w:tc>
         <w:tc>
           <w:tcPr>
-            <w:tcW w:type="dxa" w:w="2160"/>
+            <w:tcW w:type="dxa" w:w="1728"/>
           </w:tcPr>
           <w:p>
             <w:r>
               <w:rPr>
                 <w:sz w:val="16"/>
               </w:rPr>
-              <w:t>2-up</w:t>
+              <w:t>Same SN</w:t>
             </w:r>
           </w:p>
         </w:tc>
         <w:tc>
           <w:tcPr>
-            <w:tcW w:type="dxa" w:w="2160"/>
+            <w:tcW w:type="dxa" w:w="1728"/>
           </w:tcPr>
           <w:p>
             <w:r>
               <w:rPr>
                 <w:sz w:val="16"/>
               </w:rPr>
-              <w:t>Two identical RIO-520 stickers</w:t>
+              <w:t>1</w:t>
             </w:r>
           </w:p>
         </w:tc>
         <w:tc>
           <w:tcPr>
-            <w:tcW w:type="dxa" w:w="2160"/>
+            <w:tcW w:type="dxa" w:w="1728"/>
           </w:tcPr>
           <w:p>
             <w:r>
               <w:rPr>
                 <w:sz w:val="16"/>
               </w:rPr>
-              <w:t>OWNERSHIP, SN, FACILITY, WBS</w:t>
+              <w:t>1</w:t>
+            </w:r>
+          </w:p>
+        </w:tc>
+        <w:tc>
+          <w:tcPr>
+            <w:tcW w:type="dxa" w:w="1728"/>
+          </w:tcPr>
+          <w:p>
+            <w:r>
+              <w:rPr>
+                <w:sz w:val="16"/>
+              </w:rPr>
+              <w:t>Two identical DBBU-Wellhead-Kit stickers</w:t>
             </w:r>
           </w:p>
         </w:tc>
@@ -1723,53 +3273,66 @@
       <w:tr>
         <w:tc>
           <w:tcPr>
-            <w:tcW w:type="dxa" w:w="2160"/>
+            <w:tcW w:type="dxa" w:w="1728"/>
           </w:tcPr>
           <w:p>
             <w:r>
               <w:rPr>
                 <w:sz w:val="16"/>
               </w:rPr>
-              <w:t>RIO Stickers #1-on pallet wrap.docx</w:t>
+              <w:t>RIO Stickers #1-pallet wrap stateline</w:t>
             </w:r>
           </w:p>
         </w:tc>
         <w:tc>
           <w:tcPr>
-            <w:tcW w:type="dxa" w:w="2160"/>
+            <w:tcW w:type="dxa" w:w="1728"/>
           </w:tcPr>
           <w:p>
             <w:r>
               <w:rPr>
                 <w:sz w:val="16"/>
               </w:rPr>
-              <w:t>2-up</w:t>
+              <w:t>Same SN</w:t>
             </w:r>
           </w:p>
         </w:tc>
         <w:tc>
           <w:tcPr>
-            <w:tcW w:type="dxa" w:w="2160"/>
+            <w:tcW w:type="dxa" w:w="1728"/>
           </w:tcPr>
           <w:p>
             <w:r>
               <w:rPr>
                 <w:sz w:val="16"/>
               </w:rPr>
-              <w:t>Two DBBU-Wellhead-Kit stickers</w:t>
+              <w:t>1</w:t>
             </w:r>
           </w:p>
         </w:tc>
         <w:tc>
           <w:tcPr>
-            <w:tcW w:type="dxa" w:w="2160"/>
+            <w:tcW w:type="dxa" w:w="1728"/>
           </w:tcPr>
           <w:p>
             <w:r>
               <w:rPr>
                 <w:sz w:val="16"/>
               </w:rPr>
-              <w:t>OWNERSHIP, SN, FACILITY, WBS</w:t>
+              <w:t>2</w:t>
+            </w:r>
+          </w:p>
+        </w:tc>
+        <w:tc>
+          <w:tcPr>
+            <w:tcW w:type="dxa" w:w="1728"/>
+          </w:tcPr>
+          <w:p>
+            <w:r>
+              <w:rPr>
+                <w:sz w:val="16"/>
+              </w:rPr>
+              <w:t>Stateline wrap with {WELLHEAD_QTY}, 2 copies</w:t>
             </w:r>
           </w:p>
         </w:tc>
@@ -1777,107 +3340,66 @@
       <w:tr>
         <w:tc>
           <w:tcPr>
-            <w:tcW w:type="dxa" w:w="2160"/>
+            <w:tcW w:type="dxa" w:w="1728"/>
           </w:tcPr>
           <w:p>
             <w:r>
               <w:rPr>
                 <w:sz w:val="16"/>
               </w:rPr>
-              <w:t>RIO Stickers #1-pallet wrap stateline.docx</w:t>
+              <w:t>Sticker on box #1 stateline</w:t>
             </w:r>
           </w:p>
         </w:tc>
         <w:tc>
           <w:tcPr>
-            <w:tcW w:type="dxa" w:w="2160"/>
+            <w:tcW w:type="dxa" w:w="1728"/>
           </w:tcPr>
           <w:p>
             <w:r>
               <w:rPr>
                 <w:sz w:val="16"/>
               </w:rPr>
-              <w:t>2-up</w:t>
+              <w:t>Diff SNs</w:t>
             </w:r>
           </w:p>
         </w:tc>
         <w:tc>
           <w:tcPr>
-            <w:tcW w:type="dxa" w:w="2160"/>
+            <w:tcW w:type="dxa" w:w="1728"/>
           </w:tcPr>
           <w:p>
             <w:r>
               <w:rPr>
                 <w:sz w:val="16"/>
               </w:rPr>
-              <w:t>Two stateline equipment stickers</w:t>
+              <w:t>2</w:t>
             </w:r>
           </w:p>
         </w:tc>
         <w:tc>
           <w:tcPr>
-            <w:tcW w:type="dxa" w:w="2160"/>
+            <w:tcW w:type="dxa" w:w="1728"/>
           </w:tcPr>
           <w:p>
             <w:r>
               <w:rPr>
                 <w:sz w:val="16"/>
               </w:rPr>
-              <w:t>OWNERSHIP, FACILITY, WBS</w:t>
+              <w:t>1</w:t>
             </w:r>
           </w:p>
         </w:tc>
-      </w:tr>
-      <w:tr>
         <w:tc>
           <w:tcPr>
-            <w:tcW w:type="dxa" w:w="2160"/>
+            <w:tcW w:type="dxa" w:w="1728"/>
           </w:tcPr>
           <w:p>
             <w:r>
               <w:rPr>
                 <w:sz w:val="16"/>
               </w:rPr>
-              <w:t>Sticker on box #1 stateline.docx</w:t>
-            </w:r>
-          </w:p>
-        </w:tc>
-        <w:tc>
-          <w:tcPr>
-            <w:tcW w:type="dxa" w:w="2160"/>
-          </w:tcPr>
-          <w:p>
-            <w:r>
-              <w:rPr>
-                <w:sz w:val="16"/>
-              </w:rPr>
-              <w:t>Full page</w:t>
-            </w:r>
-          </w:p>
-        </w:tc>
-        <w:tc>
-          <w:tcPr>
-            <w:tcW w:type="dxa" w:w="2160"/>
-          </w:tcPr>
-          <w:p>
-            <w:r>
-              <w:rPr>
-                <w:sz w:val="16"/>
-              </w:rPr>
-              <w:t>Single Box #3 stateline sticker</w:t>
-            </w:r>
-          </w:p>
-        </w:tc>
-        <w:tc>
-          <w:tcPr>
-            <w:tcW w:type="dxa" w:w="2160"/>
-          </w:tcPr>
-          <w:p>
-            <w:r>
-              <w:rPr>
-                <w:sz w:val="16"/>
-              </w:rPr>
-              <w:t>OWNERSHIP, SN, FACILITY, WBS</w:t>
+              <w:t>Box #3 stateline, pairs consecutive SNs</w:t>
             </w:r>
           </w:p>
         </w:tc>
@@ -1944,7 +3466,7 @@
     </w:p>
     <w:p>
       <w:r>
-        <w:t>Your template is not using the table-based layout. Create a table with exact row heights (5.15" for half-sheet, 10.3" for full page). The auto-scaling will also reduce font sizes for long text, but the table structure is what guarantees single-page output.</w:t>
+        <w:t>Your template is not using the table-based layout. Create a table with exact row heights (5.15" per half). The auto-scaling will also reduce font sizes for long text, but the table structure is what guarantees single-page output.</w:t>
       </w:r>
     </w:p>
     <w:p>
@@ -1959,6 +3481,20 @@
     <w:p>
       <w:r>
         <w:t>The auto-scaling reduced the font because the replacement text was very long. Consider using a shorter value or abbreviation. The minimum font size is 14pt.</w:t>
+      </w:r>
+    </w:p>
+    <w:p>
+      <w:r>
+        <w:rPr>
+          <w:b/>
+          <w:sz w:val="20"/>
+        </w:rPr>
+        <w:t>Getting double the stickers I need</w:t>
+      </w:r>
+    </w:p>
+    <w:p>
+      <w:r>
+        <w:t>Check your Per Page and Copies Per SN settings in the kit config rule. If the top and bottom are for different serial numbers, set Per Page = 2 so the system pairs them. If both halves are the same SN, set Per Page = 1. See the Serial Number Modes section.</w:t>
       </w:r>
     </w:p>
     <w:p>

</xml_diff>